<commit_message>
Record validation results, report updates, and active scale trials
</commit_message>
<xml_diff>
--- a/reports/모델링결과서_김형수없는김형수.docx
+++ b/reports/모델링결과서_김형수없는김형수.docx
@@ -1581,7 +1581,7 @@
                 <w:sz w:val="22"/>
                 <w:color w:val="000000"/>
               </w:rPr>
-              <w:t xml:space="preserve">4배 MiT의 원리는 모델의 파라미터를 늘리는 것이 아니라 더 확대된 조직을 보여주는 것이다. 입력 조각은 2배와 4배 모두 1024×1024다. 대부분 사진에서 2배는 원본 약 512×512 영역을, 4배는 약 256×256 영역을 본다. 얇은 조직의 표현은 커지지만 주변 맥락은 줄어들 수 있어 검증이 필요하다.</w:t>
+              <w:t xml:space="preserve">4배 MiT의 원리는 모델의 파라미터를 늘리는 것이 아니라 더 확대된 조직을 보여주는 것이다. 기존 배율 비교에서 입력 조각은 2배와 4배 모두 1024×1024였다. 대부분 사진에서 2배는 원본 약 512×512 영역을, 4배는 약 256×256 영역을 본다. 얇은 조직의 표현은 커지지만 주변 맥락은 줄어들 수 있어 검증이 필요하다.</w:t>
             </w:r>
           </w:p>
           <w:p>
@@ -2136,7 +2136,7 @@
                       <w:color w:val="000000"/>
                       <w:b/>
                     </w:rPr>
-                    <w:t xml:space="preserve">4배 MiT 추가 검증 설정</w:t>
+                    <w:t xml:space="preserve">기존 4배 MiT 전체 검증 설정</w:t>
                   </w:r>
                 </w:p>
               </w:tc>
@@ -2345,7 +2345,7 @@
                 <w:sz w:val="22"/>
                 <w:color w:val="000000"/>
               </w:rPr>
-              <w:t xml:space="preserve">합금 번호 단위로 90장을 5개 fold에 나눠, 매번 72장으로 학습하고 해당 모델이 보지 않은 18장으로 평가한다. 같은 합금의 사진은 서로 다른 fold에 나누지 않았다. 이번에는 비용을 줄이기 위해 seed 1의 남은 세 fold를 생략하고 seed 0만 전체 검증했다.</w:t>
+              <w:t xml:space="preserve">합금 번호 단위로 90장을 5개 fold에 나눠, 매번 72장으로 학습하고 해당 모델이 보지 않은 18장으로 평가한다. 같은 합금의 사진은 서로 다른 fold에 나누지 않았다. 앞선 시드 비교에서는 비용을 줄이기 위해 seed 1의 남은 세 fold를 생략하고 seed 0만 전체 검증했다.</w:t>
             </w:r>
           </w:p>
           <w:p>
@@ -4046,7 +4046,7 @@
                 <w:color w:val="000000"/>
                 <w:b/>
               </w:rPr>
-              <w:t xml:space="preserve">라. 예비 결과와 시드 비교 범위</w:t>
+              <w:t xml:space="preserve">라. 시드와 학습 조각 및 선택적 혼합의 예비 검증</w:t>
             </w:r>
           </w:p>
           <w:p>
@@ -4077,6 +4077,301 @@
                 <w:color w:val="000000"/>
               </w:rPr>
               <w:t xml:space="preserve">기존 두 시드 평균을 추가한 예비 조합의 +0.3069%p 개선은 이번 seed 0 단독 추가 조합과 구성이 다르다. 예비 점수나 36장의 점수를 이번 전체 90장 결과와 직접 빼서 비교하지 않는다.</w:t>
+            </w:r>
+          </w:p>
+          <w:tbl>
+            <w:tblPr>
+              <w:tblW w:w="8500" w:type="dxa"/>
+              <w:tblBorders>
+                <w:top w:val="single" w:sz="4" w:color="D9D9D9"/>
+                <w:left w:val="single" w:sz="4" w:color="D9D9D9"/>
+                <w:bottom w:val="single" w:sz="4" w:color="D9D9D9"/>
+                <w:right w:val="single" w:sz="4" w:color="D9D9D9"/>
+                <w:insideH w:val="single" w:sz="4" w:color="D9D9D9"/>
+                <w:insideV w:val="single" w:sz="4" w:color="D9D9D9"/>
+              </w:tblBorders>
+              <w:tblCellMar>
+                <w:top w:w="80" w:type="dxa"/>
+                <w:bottom w:w="80" w:type="dxa"/>
+                <w:left w:w="80" w:type="dxa"/>
+                <w:right w:w="80" w:type="dxa"/>
+              </w:tblCellMar>
+            </w:tblPr>
+            <w:tblGrid>
+              <w:gridCol w:w="6100"/>
+              <w:gridCol w:w="2400"/>
+            </w:tblGrid>
+            <w:tr>
+              <w:trPr>
+                <w:tblHeader/>
+              </w:trPr>
+              <w:tc>
+                <w:tcPr>
+                  <w:tcW w:w="6100" w:type="dxa"/>
+                  <w:vAlign w:val="center"/>
+                  <w:shd w:fill="EFEFEF"/>
+                </w:tcPr>
+                <w:p>
+                  <w:pPr>
+                    <w:pStyle w:val="a3"/>
+                    <w:spacing w:before="0" w:after="30" w:line="312" w:lineRule="auto"/>
+                    <w:jc w:val="left"/>
+                  </w:pPr>
+                  <w:r>
+                    <w:rPr>
+                      <w:rFonts w:ascii="돋움" w:eastAsia="돋움" w:hAnsi="돋움"/>
+                      <w:sz w:val="20"/>
+                      <w:color w:val="000000"/>
+                      <w:b/>
+                    </w:rPr>
+                    <w:t xml:space="preserve">동일한 fold 0·1의 36장 비교</w:t>
+                  </w:r>
+                </w:p>
+              </w:tc>
+              <w:tc>
+                <w:tcPr>
+                  <w:tcW w:w="2400" w:type="dxa"/>
+                  <w:vAlign w:val="center"/>
+                  <w:shd w:fill="EFEFEF"/>
+                </w:tcPr>
+                <w:p>
+                  <w:pPr>
+                    <w:pStyle w:val="a3"/>
+                    <w:spacing w:before="0" w:after="30" w:line="312" w:lineRule="auto"/>
+                    <w:jc w:val="center"/>
+                  </w:pPr>
+                  <w:r>
+                    <w:rPr>
+                      <w:rFonts w:ascii="돋움" w:eastAsia="돋움" w:hAnsi="돋움"/>
+                      <w:sz w:val="20"/>
+                      <w:color w:val="000000"/>
+                      <w:b/>
+                    </w:rPr>
+                    <w:t xml:space="preserve">mIoU (%)</w:t>
+                  </w:r>
+                </w:p>
+              </w:tc>
+            </w:tr>
+            <w:tr>
+              <w:tc>
+                <w:tcPr>
+                  <w:tcW w:w="6100" w:type="dxa"/>
+                  <w:vAlign w:val="center"/>
+                </w:tcPr>
+                <w:p>
+                  <w:pPr>
+                    <w:pStyle w:val="a3"/>
+                    <w:spacing w:before="0" w:after="30" w:line="312" w:lineRule="auto"/>
+                    <w:jc w:val="left"/>
+                  </w:pPr>
+                  <w:r>
+                    <w:rPr>
+                      <w:rFonts w:ascii="돋움" w:eastAsia="돋움" w:hAnsi="돋움"/>
+                      <w:sz w:val="20"/>
+                      <w:color w:val="000000"/>
+                    </w:rPr>
+                    <w:t xml:space="preserve">기존 sub6</w:t>
+                  </w:r>
+                </w:p>
+              </w:tc>
+              <w:tc>
+                <w:tcPr>
+                  <w:tcW w:w="2400" w:type="dxa"/>
+                  <w:vAlign w:val="center"/>
+                </w:tcPr>
+                <w:p>
+                  <w:pPr>
+                    <w:pStyle w:val="a3"/>
+                    <w:spacing w:before="0" w:after="30" w:line="312" w:lineRule="auto"/>
+                    <w:jc w:val="center"/>
+                  </w:pPr>
+                  <w:r>
+                    <w:rPr>
+                      <w:rFonts w:ascii="돋움" w:eastAsia="돋움" w:hAnsi="돋움"/>
+                      <w:sz w:val="20"/>
+                      <w:color w:val="000000"/>
+                    </w:rPr>
+                    <w:t xml:space="preserve">81.3245</w:t>
+                  </w:r>
+                </w:p>
+              </w:tc>
+            </w:tr>
+            <w:tr>
+              <w:tc>
+                <w:tcPr>
+                  <w:tcW w:w="6100" w:type="dxa"/>
+                  <w:vAlign w:val="center"/>
+                </w:tcPr>
+                <w:p>
+                  <w:pPr>
+                    <w:pStyle w:val="a3"/>
+                    <w:spacing w:before="0" w:after="30" w:line="312" w:lineRule="auto"/>
+                    <w:jc w:val="left"/>
+                  </w:pPr>
+                  <w:r>
+                    <w:rPr>
+                      <w:rFonts w:ascii="돋움" w:eastAsia="돋움" w:hAnsi="돋움"/>
+                      <w:sz w:val="20"/>
+                      <w:color w:val="000000"/>
+                    </w:rPr>
+                    <w:t xml:space="preserve">새 crop1024 대조군 전체 혼합</w:t>
+                  </w:r>
+                </w:p>
+              </w:tc>
+              <w:tc>
+                <w:tcPr>
+                  <w:tcW w:w="2400" w:type="dxa"/>
+                  <w:vAlign w:val="center"/>
+                </w:tcPr>
+                <w:p>
+                  <w:pPr>
+                    <w:pStyle w:val="a3"/>
+                    <w:spacing w:before="0" w:after="30" w:line="312" w:lineRule="auto"/>
+                    <w:jc w:val="center"/>
+                  </w:pPr>
+                  <w:r>
+                    <w:rPr>
+                      <w:rFonts w:ascii="돋움" w:eastAsia="돋움" w:hAnsi="돋움"/>
+                      <w:sz w:val="20"/>
+                      <w:color w:val="000000"/>
+                    </w:rPr>
+                    <w:t xml:space="preserve">81.4535</w:t>
+                  </w:r>
+                </w:p>
+              </w:tc>
+            </w:tr>
+            <w:tr>
+              <w:tc>
+                <w:tcPr>
+                  <w:tcW w:w="6100" w:type="dxa"/>
+                  <w:vAlign w:val="center"/>
+                </w:tcPr>
+                <w:p>
+                  <w:pPr>
+                    <w:pStyle w:val="a3"/>
+                    <w:spacing w:before="0" w:after="30" w:line="312" w:lineRule="auto"/>
+                    <w:jc w:val="left"/>
+                  </w:pPr>
+                  <w:r>
+                    <w:rPr>
+                      <w:rFonts w:ascii="돋움" w:eastAsia="돋움" w:hAnsi="돋움"/>
+                      <w:sz w:val="20"/>
+                      <w:color w:val="000000"/>
+                    </w:rPr>
+                    <w:t xml:space="preserve">새 crop1536 후보 전체 혼합</w:t>
+                  </w:r>
+                </w:p>
+              </w:tc>
+              <w:tc>
+                <w:tcPr>
+                  <w:tcW w:w="2400" w:type="dxa"/>
+                  <w:vAlign w:val="center"/>
+                </w:tcPr>
+                <w:p>
+                  <w:pPr>
+                    <w:pStyle w:val="a3"/>
+                    <w:spacing w:before="0" w:after="30" w:line="312" w:lineRule="auto"/>
+                    <w:jc w:val="center"/>
+                  </w:pPr>
+                  <w:r>
+                    <w:rPr>
+                      <w:rFonts w:ascii="돋움" w:eastAsia="돋움" w:hAnsi="돋움"/>
+                      <w:sz w:val="20"/>
+                      <w:color w:val="000000"/>
+                    </w:rPr>
+                    <w:t xml:space="preserve">81.6733</w:t>
+                  </w:r>
+                </w:p>
+              </w:tc>
+            </w:tr>
+            <w:tr>
+              <w:tc>
+                <w:tcPr>
+                  <w:tcW w:w="6100" w:type="dxa"/>
+                  <w:vAlign w:val="center"/>
+                </w:tcPr>
+                <w:p>
+                  <w:pPr>
+                    <w:pStyle w:val="a3"/>
+                    <w:spacing w:before="0" w:after="30" w:line="312" w:lineRule="auto"/>
+                    <w:jc w:val="left"/>
+                  </w:pPr>
+                  <w:r>
+                    <w:rPr>
+                      <w:rFonts w:ascii="돋움" w:eastAsia="돋움" w:hAnsi="돋움"/>
+                      <w:sz w:val="20"/>
+                      <w:color w:val="000000"/>
+                    </w:rPr>
+                    <w:t xml:space="preserve">crop1536 선택적 혼합</w:t>
+                  </w:r>
+                </w:p>
+              </w:tc>
+              <w:tc>
+                <w:tcPr>
+                  <w:tcW w:w="2400" w:type="dxa"/>
+                  <w:vAlign w:val="center"/>
+                </w:tcPr>
+                <w:p>
+                  <w:pPr>
+                    <w:pStyle w:val="a3"/>
+                    <w:spacing w:before="0" w:after="30" w:line="312" w:lineRule="auto"/>
+                    <w:jc w:val="center"/>
+                  </w:pPr>
+                  <w:r>
+                    <w:rPr>
+                      <w:rFonts w:ascii="돋움" w:eastAsia="돋움" w:hAnsi="돋움"/>
+                      <w:sz w:val="20"/>
+                      <w:color w:val="000000"/>
+                    </w:rPr>
+                    <w:t xml:space="preserve">81.5314</w:t>
+                  </w:r>
+                </w:p>
+              </w:tc>
+            </w:tr>
+          </w:tbl>
+          <w:p>
+            <w:pPr>
+              <w:pStyle w:val="a3"/>
+              <w:spacing w:before="0" w:after="80" w:line="312" w:lineRule="auto"/>
+              <w:jc w:val="left"/>
+            </w:pPr>
+            <w:r>
+              <w:rPr>
+                <w:rFonts w:ascii="돋움" w:eastAsia="돋움" w:hAnsi="돋움"/>
+                <w:sz w:val="22"/>
+                <w:color w:val="000000"/>
+              </w:rPr>
+              <w:t xml:space="preserve"/>
+            </w:r>
+          </w:p>
+          <w:p>
+            <w:pPr>
+              <w:pStyle w:val="a3"/>
+              <w:spacing w:before="0" w:after="80" w:line="312" w:lineRule="auto"/>
+              <w:jc w:val="left"/>
+            </w:pPr>
+            <w:r>
+              <w:rPr>
+                <w:rFonts w:ascii="돋움" w:eastAsia="돋움" w:hAnsi="돋움"/>
+                <w:sz w:val="22"/>
+                <w:color w:val="000000"/>
+              </w:rPr>
+              <w:t xml:space="preserve">학습 조각은 crop1024와 crop1536으로 비교했다. 두 조건 모두 seed 0, 60 epoch, 실제 batch 2·누적 2, 추론 tile1536을 적용하고 마지막 epoch를 평가했다. crop1536의 전체 혼합은 대조군보다 +0.2198%p 높았으며 합금 그룹 bootstrap 95% 구간은 [+0.0098, +0.4501]%p였다. 다만 기존 4배 모델의 같은 36장 혼합 81.6433% 대비 이득은 +0.0300%p이고 구간 [-0.0736, +0.1634]%p에 0이 포함됐다.</w:t>
+            </w:r>
+          </w:p>
+          <w:p>
+            <w:pPr>
+              <w:pStyle w:val="a3"/>
+              <w:spacing w:before="0" w:after="80" w:line="312" w:lineRule="auto"/>
+              <w:jc w:val="left"/>
+            </w:pPr>
+            <w:r>
+              <w:rPr>
+                <w:rFonts w:ascii="돋움" w:eastAsia="돋움" w:hAnsi="돋움"/>
+                <w:sz w:val="22"/>
+                <w:color w:val="000000"/>
+              </w:rPr>
+              <w:t xml:space="preserve">선택적 혼합은 sub6의 상위 두 클래스 확률 차이가 0.15 미만인 픽셀에만 세 모델의 동일 비중 평균을 적용했다. 전체 혼합보다 -0.1419%p 낮아 이번 규칙은 채택하지 않았다. 저장된 예측을 섞은 평가이며 관심 영역을 잘라 확대 재추론하지는 않았다. 반복 검토한 36장의 예비 비교이므로 전체 90장 성능이나 독립 검증으로 해석하지 않는다.</w:t>
             </w:r>
           </w:p>
           <w:p>
@@ -4161,7 +4456,7 @@
                 <w:sz w:val="22"/>
                 <w:color w:val="000000"/>
               </w:rPr>
-              <w:t xml:space="preserve">최고 관측 점수는 80.9014%였지만, 최종 채택 모델은 sub6(80.7884%)이다. 평균 상승만으로 교체하지 않고, 합금별 변동과 개선 구간 및 추가 추론 비용을 함께 판단했다. 추가 학습 없이 이번 검토를 종료했다.</w:t>
+              <w:t xml:space="preserve">완료된 전체 90장 검증의 최고 관측 점수는 80.9014%였지만, 현재 채택 모델은 sub6(80.7884%)이다. 평균 상승만으로 교체하지 않고 합금별 변동과 개선 구간 및 추가 추론 비용을 함께 판단했다. crop1536과 동일 조건 crop1024의 남은 fold 2·3·4를 각각 60 epoch로 학습해 전체 5-fold 검증을 진행하며, 완료 후 채택 여부를 다시 판단한다. 전체 결과는 아직 확정하지 않았다.</w:t>
             </w:r>
           </w:p>
           <w:p>
@@ -4267,7 +4562,7 @@
                 <w:sz w:val="22"/>
                 <w:color w:val="000000"/>
               </w:rPr>
-              <w:t xml:space="preserve">추가 학습은 seed 0의 세 fold로 종료했고, 이어서 재학습 없는 비중·타일 비교만 완료했다. 자체 학습 체크포인트와 결과·코드·재현 기록을 보관하며 새로운 실험을 예약하지 않았다. 주요 근거는 baseline/analysis, review13~17 결과, seed0_full_results.json 및 seed0_artifacts.json이다.</w:t>
+              <w:t xml:space="preserve">자체 학습 체크포인트와 결과·코드·재현 기록을 보관한다. 주요 근거는 baseline/analysis, review13~17, seed0_full_results.json, seed0_artifacts.json 및 학습 조각 비교 review18_crop, 선택적 혼합 review19_selective 결과다. 전체 검증은 완료된 fold 0·1을 보존하고 남은 fold 2·3·4만 동일 설정으로 추가하며, 실행 기록은 review20_crop_full에 보관한다.</w:t>
             </w:r>
           </w:p>
         </w:tc>

</xml_diff>